<commit_message>
feat: show complete action hints, allow auto-sizing container, and default modal to closed state
</commit_message>
<xml_diff>
--- a/動作提示.docx
+++ b/動作提示.docx
@@ -97,7 +97,55 @@
                 <w:kern w:val="0"/>
                 <w14:ligatures w14:val="none"/>
               </w:rPr>
-              <w:t>(面向)</w:t>
+              <w:t>甲</w:t>
+            </w:r>
+            <w:r>
+              <w:rPr>
+                <w:rFonts w:ascii="新細明體" w:eastAsia="新細明體" w:hAnsi="新細明體" w:cs="新細明體" w:hint="eastAsia"/>
+                <w:kern w:val="0"/>
+                <w14:ligatures w14:val="none"/>
+              </w:rPr>
+              <w:t>舞台，</w:t>
+            </w:r>
+            <w:r>
+              <w:rPr>
+                <w:rFonts w:ascii="新細明體" w:eastAsia="新細明體" w:hAnsi="新細明體" w:cs="新細明體"/>
+                <w:kern w:val="0"/>
+                <w14:ligatures w14:val="none"/>
+              </w:rPr>
+              <w:t>45</w:t>
+            </w:r>
+            <w:r>
+              <w:rPr>
+                <w:rFonts w:ascii="新細明體" w:eastAsia="新細明體" w:hAnsi="新細明體" w:cs="新細明體" w:hint="eastAsia"/>
+                <w:kern w:val="0"/>
+                <w14:ligatures w14:val="none"/>
+              </w:rPr>
+              <w:t>度</w:t>
+            </w:r>
+            <w:r>
+              <w:rPr>
+                <w:rFonts w:ascii="新細明體" w:eastAsia="新細明體" w:hAnsi="新細明體" w:cs="新細明體" w:hint="eastAsia"/>
+                <w:kern w:val="0"/>
+                <w14:ligatures w14:val="none"/>
+              </w:rPr>
+              <w:t>，</w:t>
+            </w:r>
+            <w:r>
+              <w:rPr>
+                <w:rFonts w:ascii="新細明體" w:eastAsia="新細明體" w:hAnsi="新細明體" w:cs="新細明體" w:hint="eastAsia"/>
+                <w:kern w:val="0"/>
+                <w14:ligatures w14:val="none"/>
+              </w:rPr>
+              <w:t>序</w:t>
+            </w:r>
+            <w:r>
+              <w:rPr>
+                <w:rFonts w:ascii="新細明體" w:eastAsia="新細明體" w:hAnsi="新細明體" w:cs="新細明體"/>
+                <w:kern w:val="0"/>
+                <w14:ligatures w14:val="none"/>
+              </w:rPr>
+              <w:t>無量量法門...請佛轉法輪</w:t>
             </w:r>
           </w:p>
           <w:p>
@@ -123,7 +171,15 @@
                 <w:kern w:val="0"/>
                 <w14:ligatures w14:val="none"/>
               </w:rPr>
-              <w:t>舞台，</w:t>
+              <w:t>舞台</w:t>
+            </w:r>
+            <w:r>
+              <w:rPr>
+                <w:rFonts w:ascii="新細明體" w:eastAsia="新細明體" w:hAnsi="新細明體" w:cs="新細明體" w:hint="eastAsia"/>
+                <w:kern w:val="0"/>
+                <w14:ligatures w14:val="none"/>
+              </w:rPr>
+              <w:t>，</w:t>
             </w:r>
             <w:r>
               <w:rPr>
@@ -139,15 +195,15 @@
                 <w:kern w:val="0"/>
                 <w14:ligatures w14:val="none"/>
               </w:rPr>
-              <w:t>度</w:t>
-            </w:r>
-            <w:r>
-              <w:rPr>
-                <w:rFonts w:ascii="新細明體" w:eastAsia="新細明體" w:hAnsi="新細明體" w:cs="新細明體"/>
-                <w:kern w:val="0"/>
-                <w14:ligatures w14:val="none"/>
-              </w:rPr>
-              <w:t>序無量量法門...請佛轉法輪</w:t>
+              <w:t>度，</w:t>
+            </w:r>
+            <w:r>
+              <w:rPr>
+                <w:rFonts w:ascii="新細明體" w:eastAsia="新細明體" w:hAnsi="新細明體" w:cs="新細明體"/>
+                <w:kern w:val="0"/>
+                <w14:ligatures w14:val="none"/>
+              </w:rPr>
+              <w:t>生:恭喜...前來禮</w:t>
             </w:r>
           </w:p>
           <w:p>
@@ -165,7 +221,7 @@
                 <w:kern w:val="0"/>
                 <w14:ligatures w14:val="none"/>
               </w:rPr>
-              <w:t>甲</w:t>
+              <w:t>乙</w:t>
             </w:r>
             <w:r>
               <w:rPr>
@@ -189,23 +245,7 @@
                 <w:kern w:val="0"/>
                 <w14:ligatures w14:val="none"/>
               </w:rPr>
-              <w:t>45</w:t>
-            </w:r>
-            <w:r>
-              <w:rPr>
-                <w:rFonts w:ascii="新細明體" w:eastAsia="新細明體" w:hAnsi="新細明體" w:cs="新細明體" w:hint="eastAsia"/>
-                <w:kern w:val="0"/>
-                <w14:ligatures w14:val="none"/>
-              </w:rPr>
-              <w:t>度，</w:t>
-            </w:r>
-            <w:r>
-              <w:rPr>
-                <w:rFonts w:ascii="新細明體" w:eastAsia="新細明體" w:hAnsi="新細明體" w:cs="新細明體"/>
-                <w:kern w:val="0"/>
-                <w14:ligatures w14:val="none"/>
-              </w:rPr>
-              <w:t>生:恭喜...前來禮</w:t>
+              <w:t>老:流逝光陰老去的苦悶分秒磋跎的警鐘</w:t>
             </w:r>
           </w:p>
           <w:p>
@@ -247,7 +287,7 @@
                 <w:kern w:val="0"/>
                 <w14:ligatures w14:val="none"/>
               </w:rPr>
-              <w:t>老:流逝光陰老去的苦悶分秒磋跎的警鐘</w:t>
+              <w:t>病:病症摧殘惡道苦報患病...無常...兇險</w:t>
             </w:r>
           </w:p>
           <w:p>
@@ -289,16 +329,14 @@
                 <w:kern w:val="0"/>
                 <w14:ligatures w14:val="none"/>
               </w:rPr>
-              <w:t>病:病症摧殘惡道苦報患病...無常...兇險</w:t>
+              <w:t>死:人生苦短..死亡的苦 醒思生命的意涵</w:t>
             </w:r>
           </w:p>
           <w:p>
             <w:pPr>
               <w:widowControl/>
               <w:rPr>
-                <w:rFonts w:ascii="新細明體" w:eastAsia="新細明體" w:hAnsi="新細明體" w:cs="新細明體"/>
-                <w:kern w:val="0"/>
-                <w14:ligatures w14:val="none"/>
+                <w:rFonts w:hint="eastAsia"/>
               </w:rPr>
             </w:pPr>
             <w:r>
@@ -331,57 +369,8 @@
                 <w:kern w:val="0"/>
                 <w14:ligatures w14:val="none"/>
               </w:rPr>
-              <w:t>死:人生苦短..死亡的苦 醒思生命的意涵</w:t>
-            </w:r>
-          </w:p>
-          <w:p>
-            <w:pPr>
-              <w:widowControl/>
-              <w:rPr>
-                <w:rFonts w:ascii="新細明體" w:eastAsia="新細明體" w:hAnsi="新細明體" w:cs="新細明體"/>
-                <w:kern w:val="0"/>
-                <w14:ligatures w14:val="none"/>
-              </w:rPr>
-            </w:pPr>
-            <w:r>
-              <w:rPr>
-                <w:rFonts w:ascii="新細明體" w:eastAsia="新細明體" w:hAnsi="新細明體" w:cs="新細明體"/>
-                <w:kern w:val="0"/>
-                <w14:ligatures w14:val="none"/>
-              </w:rPr>
-              <w:t>乙</w:t>
-            </w:r>
-            <w:r>
-              <w:rPr>
-                <w:rFonts w:ascii="新細明體" w:eastAsia="新細明體" w:hAnsi="新細明體" w:cs="新細明體" w:hint="eastAsia"/>
-                <w:kern w:val="0"/>
-                <w14:ligatures w14:val="none"/>
-              </w:rPr>
-              <w:t>舞台</w:t>
-            </w:r>
-            <w:r>
-              <w:rPr>
-                <w:rFonts w:ascii="新細明體" w:eastAsia="新細明體" w:hAnsi="新細明體" w:cs="新細明體" w:hint="eastAsia"/>
-                <w:kern w:val="0"/>
-                <w14:ligatures w14:val="none"/>
-              </w:rPr>
-              <w:t>，</w:t>
-            </w:r>
-            <w:r>
-              <w:rPr>
-                <w:rFonts w:ascii="新細明體" w:eastAsia="新細明體" w:hAnsi="新細明體" w:cs="新細明體"/>
-                <w:kern w:val="0"/>
-                <w14:ligatures w14:val="none"/>
-              </w:rPr>
               <w:t>甲六度:開示...</w:t>
             </w:r>
-          </w:p>
-          <w:p>
-            <w:pPr>
-              <w:rPr>
-                <w:rFonts w:hint="eastAsia"/>
-              </w:rPr>
-            </w:pPr>
           </w:p>
         </w:tc>
       </w:tr>
@@ -432,24 +421,6 @@
                 <w:kern w:val="0"/>
                 <w14:ligatures w14:val="none"/>
               </w:rPr>
-              <w:t>（面向）</w:t>
-            </w:r>
-          </w:p>
-          <w:p>
-            <w:pPr>
-              <w:widowControl/>
-              <w:rPr>
-                <w:rFonts w:ascii="新細明體" w:eastAsia="新細明體" w:hAnsi="新細明體" w:cs="新細明體"/>
-                <w:kern w:val="0"/>
-                <w14:ligatures w14:val="none"/>
-              </w:rPr>
-            </w:pPr>
-            <w:r>
-              <w:rPr>
-                <w:rFonts w:ascii="新細明體" w:eastAsia="新細明體" w:hAnsi="新細明體" w:cs="新細明體" w:hint="eastAsia"/>
-                <w:kern w:val="0"/>
-                <w14:ligatures w14:val="none"/>
-              </w:rPr>
               <w:t>乙舞台，</w:t>
             </w:r>
             <w:r>
@@ -572,24 +543,6 @@
             <w:pPr>
               <w:widowControl/>
               <w:rPr>
-                <w:rFonts w:ascii="新細明體" w:eastAsia="新細明體" w:hAnsi="新細明體" w:cs="新細明體"/>
-                <w:kern w:val="0"/>
-                <w14:ligatures w14:val="none"/>
-              </w:rPr>
-            </w:pPr>
-            <w:r>
-              <w:rPr>
-                <w:rFonts w:ascii="新細明體" w:eastAsia="新細明體" w:hAnsi="新細明體" w:cs="新細明體" w:hint="eastAsia"/>
-                <w:kern w:val="0"/>
-                <w14:ligatures w14:val="none"/>
-              </w:rPr>
-              <w:t>（面向）</w:t>
-            </w:r>
-          </w:p>
-          <w:p>
-            <w:pPr>
-              <w:widowControl/>
-              <w:rPr>
                 <w:rFonts w:hint="eastAsia"/>
               </w:rPr>
             </w:pPr>
@@ -663,24 +616,6 @@
             </w:pPr>
             <w:r>
               <w:rPr>
-                <w:rFonts w:ascii="新細明體" w:eastAsia="新細明體" w:hAnsi="新細明體" w:cs="新細明體" w:hint="eastAsia"/>
-                <w:kern w:val="0"/>
-                <w14:ligatures w14:val="none"/>
-              </w:rPr>
-              <w:t>（面向）</w:t>
-            </w:r>
-          </w:p>
-          <w:p>
-            <w:pPr>
-              <w:widowControl/>
-              <w:rPr>
-                <w:rFonts w:ascii="新細明體" w:eastAsia="新細明體" w:hAnsi="新細明體" w:cs="新細明體"/>
-                <w:kern w:val="0"/>
-                <w14:ligatures w14:val="none"/>
-              </w:rPr>
-            </w:pPr>
-            <w:r>
-              <w:rPr>
                 <w:rFonts w:ascii="新細明體" w:eastAsia="新細明體" w:hAnsi="新細明體" w:cs="新細明體"/>
                 <w:kern w:val="0"/>
                 <w14:ligatures w14:val="none"/>
@@ -845,24 +780,6 @@
           <w:tcPr>
             <w:tcW w:w="6174" w:type="dxa"/>
           </w:tcPr>
-          <w:p>
-            <w:pPr>
-              <w:widowControl/>
-              <w:rPr>
-                <w:rFonts w:ascii="新細明體" w:eastAsia="新細明體" w:hAnsi="新細明體" w:cs="新細明體"/>
-                <w:kern w:val="0"/>
-                <w14:ligatures w14:val="none"/>
-              </w:rPr>
-            </w:pPr>
-            <w:r>
-              <w:rPr>
-                <w:rFonts w:ascii="新細明體" w:eastAsia="新細明體" w:hAnsi="新細明體" w:cs="新細明體" w:hint="eastAsia"/>
-                <w:kern w:val="0"/>
-                <w14:ligatures w14:val="none"/>
-              </w:rPr>
-              <w:t>（面向）</w:t>
-            </w:r>
-          </w:p>
           <w:p>
             <w:pPr>
               <w:widowControl/>

</xml_diff>